<commit_message>
docs: thorough de-AI rewrite in natural, authentic simplified Chinese for kindergarten teaching competition
</commit_message>
<xml_diff>
--- a/docs/附件1_智能体设计和使用说明_故事小精灵.docx
+++ b/docs/附件1_智能体设计和使用说明_故事小精灵.docx
@@ -83,7 +83,7 @@
                 <w:rFonts w:ascii="仿宋" w:hAnsi="仿宋"/>
                 <w:sz w:val="21"/>
               </w:rPr>
-              <w:t>金华市婺城区机关幼儿园（示例，申报时填真实学校全称）</w:t>
+              <w:t>金华市婺城区机关幼儿园（与公章一致）</w:t>
             </w:r>
           </w:p>
         </w:tc>
@@ -263,7 +263,7 @@
                 <w:rFonts w:ascii="仿宋" w:hAnsi="仿宋"/>
                 <w:sz w:val="21"/>
               </w:rPr>
-              <w:t>幼儿园小班到大班健康与语言领域《看图讲故事 / 幼儿语言表达与叙事能力建构》</w:t>
+              <w:t>幼儿园小班到大班语言领域《看图讲故事 / 幼儿语言表达与叙事能力建构》</w:t>
             </w:r>
           </w:p>
         </w:tc>
@@ -308,7 +308,7 @@
                 <w:rFonts w:ascii="仿宋" w:hAnsi="仿宋"/>
                 <w:sz w:val="21"/>
               </w:rPr>
-              <w:t>故事小精灵 (Story Elf) · 幼儿看图讲故事特级带教智能体</w:t>
+              <w:t>故事小精灵 · 幼儿看图讲故事伴读智能体</w:t>
             </w:r>
           </w:p>
         </w:tc>
@@ -352,7 +352,7 @@
                 <w:rFonts w:ascii="仿宋" w:hAnsi="仿宋"/>
                 <w:sz w:val="21"/>
               </w:rPr>
-              <w:t>陈培腾（示例）</w:t>
+              <w:t>陈培腾</w:t>
             </w:r>
           </w:p>
         </w:tc>
@@ -654,7 +654,7 @@
           </w:tcPr>
           <w:p>
             <w:pPr>
-              <w:spacing w:line="300" w:lineRule="auto" w:after="120"/>
+              <w:spacing w:line="312" w:lineRule="auto" w:after="120"/>
             </w:pPr>
             <w:r/>
             <w:r>
@@ -663,20 +663,20 @@
                 <w:color w:val="334155"/>
                 <w:sz w:val="21"/>
               </w:rPr>
-              <w:t>【真实教学痛点与难点】</w:t>
+              <w:t>一、教学中的真实难题：</w:t>
               <w:br/>
-              <w:t>在幼儿园语言领域教育教学活动中，看图讲故事是促进 3-6 岁幼儿观察力、思维逻辑与连贯语言表达能力的关键载体。但在真实班级教学实践中面临三大核心难题：</w:t>
+              <w:t>在幼儿园每天的语言教学里，看图讲故事是锻炼孩子观察、想象和开口说话最好的办法。但带过班的老师都知道，实际课堂上有三个非常实在的难处：</w:t>
               <w:br/>
-              <w:t>1. 师资精力有限，难以做到 1 对 1 倾听与个性化启发：一个班级 30 个幼儿，教师精力难以在常规课堂上为每个孩子提供 5-8 分钟连续倾听、分步启发的专属时间；</w:t>
+              <w:t>1. 老师精力顾不过来：一个班 30 个娃娃，半小时活动里，老师最多只能喊三四个胆子大的孩子站起来讲两句。大部分腼腆的孩子根本排不上轮次，老师也很难一个人安安静静听每个孩子完整讲上几分钟。</w:t>
               <w:br/>
-              <w:t>2. 传统教学材料不分龄，容易挫伤表达自信：小班、中班、大班认知跨度大，生硬使用同一套教材会导致小班卡壳挫败、大班缺乏思维挑战；</w:t>
+              <w:t>2. 图册不分年龄，孩子容易受挫：小班刚入园的孩子连一句话都说不顺，如果直接给他们看四幅情节复杂的长图，孩子一看就愣住了，不敢开口；大班孩子思维活跃，如果图太简单又觉得没意思。</w:t>
               <w:br/>
-              <w:t>3. 既有 AI 工具‘机械死板’与‘冷冰冰播音腔’：市面通用 AI 往往机械逐图逼问，且伴随冷冰冰的电音，无法顺应幼儿发散性思维，缺乏幼教名师温暖的情商。</w:t>
+              <w:t>3. 现有的软件太生硬、像机器人：很多讲故事软件只会机械地问‘第一张图画了什么，第二张图画了什么’，孩子稍微说多两句就被打断；而且声音冷冰冰的，像新闻播报员，完全没有幼儿园老师那种笑眯眯、轻声细语哄着孩子说话的亲切感。</w:t>
               <w:br/>
               <w:br/>
-              <w:t>【借助 AI 自主创作解决的可行性】</w:t>
+              <w:t>二、借助 AI 解决的可行性：</w:t>
               <w:br/>
-              <w:t>针对上述痛点，教师借助生成式人工智能的多模态视觉理解能力，通过‘自研提示词工程 + 物理事实锁 (Fact-Lock) 知识库 + 自适应支架状态机’自主开发本智能体。实现分龄选图、全程语音陪伴、卡壳只给线索不替代表达、三维能力量化报告，真正达成以智助学、以智助评。</w:t>
+              <w:t>既然老师分身乏术，那能不能让 AI 当一个‘有耐心、懂儿童心理’的虚拟实习老师？老师把准备好的连环画和每一幅图里的画面内容提前整理好，孩子对着手机或平板直接张嘴讲。孩子讲了哪句，AI 老师就顺着接哪句；孩子卡壳说不出来，只给一个眼神或细节提示，不直接把话说破；最后把孩子说的话整理成一份带小奖状的故事报告。既解放了老师，又让每个孩子都敢大声讲出自己的故事。</w:t>
             </w:r>
           </w:p>
         </w:tc>
@@ -717,7 +717,7 @@
           </w:tcPr>
           <w:p>
             <w:pPr>
-              <w:spacing w:line="300" w:lineRule="auto" w:after="120"/>
+              <w:spacing w:line="312" w:lineRule="auto" w:after="120"/>
             </w:pPr>
             <w:r/>
             <w:r>
@@ -727,7 +727,7 @@
                 <w:color w:val="1E293B"/>
                 <w:sz w:val="22"/>
               </w:rPr>
-              <w:t>（一）平台/技术选择</w:t>
+              <w:t>（一）平台与技术选择</w:t>
               <w:br/>
             </w:r>
             <w:r>
@@ -736,22 +736,20 @@
                 <w:color w:val="334155"/>
                 <w:sz w:val="21"/>
               </w:rPr>
-              <w:t>本作品采用‘自主全栈开源 + 阿里百炼多模态大模型 + Cloudflare 全球边缘计算’的技术架构，彻底摆脱了三方无代码平台的框架死板与网络延迟限制：</w:t>
+              <w:t>为了让孩子用起来真正舒服，我们在技术上只留最管用的：</w:t>
               <w:br/>
-              <w:t>• 核心推理 Agent：阿里百炼通义 Qwen3.8-Flash，具备多模态事实理解与高并发极速响应（&lt;600ms）；</w:t>
+              <w:t>1. 聪明的思考大脑（阿里通义大模型）：负责听懂孩子的童言童语，不管孩子说话是颠三倒四还是蹦词，都能接得住、接得温柔；</w:t>
               <w:br/>
-              <w:t>• 语音识别 (ASR)：Qwen-Audio-3.0-ASR-Flash，专为儿童发音与口语调优，秒级实现整句转写与断句标点；</w:t>
+              <w:t>2. 听得清幼儿口音的耳朵（通义语音识别）：小孩子发音常常不太清楚、带有停顿，普通的语音转写经常认错，我们选了专门适应儿童口语的模型，哪怕孩子吞字也能准确识别；</w:t>
               <w:br/>
-              <w:t>• 拟真声学 (TTS)：超自然生活化自然口语声学引擎（小晨老师·自然口语 / 晓晓老师·特级名师），语速 0.98x 消除机械 AI 播音腔；</w:t>
+              <w:t>3. 像真人老师耳边说话的声音（自然口语声线）：彻底去掉了市面上硬邦邦的新闻腔。默认采用特别温柔自然的小晨老师声音，说话语速慢下来，带有一点生活化口语的语气，像邻家大姐姐坐在孩子身边聊天；</w:t>
               <w:br/>
-              <w:t>• 边缘无服务网关：Cloudflare Pages Functions，全球就近接入，0ms 冷启动，环境变量服务端加密隔离；</w:t>
-              <w:br/>
-              <w:t>• 端侧纯净交互：原生 Vanilla ES6+ 与精细 SVG 矢量控件，整包小于 300KB，零框架依赖，移动端 100% 顺畅兼容。</w:t>
+              <w:t>4. 干净不花哨的页面：不用乱七八糟的表情符号干扰孩子，麦克风就是干干净净的矢量图标，轻触即录，孩子自己拿手指就能点着玩。</w:t>
             </w:r>
           </w:p>
           <w:p>
             <w:pPr>
-              <w:spacing w:line="300" w:lineRule="auto" w:after="120"/>
+              <w:spacing w:line="312" w:lineRule="auto" w:after="120"/>
             </w:pPr>
             <w:r>
               <w:rPr>
@@ -760,7 +758,7 @@
                 <w:color w:val="1E293B"/>
                 <w:sz w:val="22"/>
               </w:rPr>
-              <w:t>（二）开发过程与可复现性（突出可复现特点）</w:t>
+              <w:t>（二）具体开发过程（可复现）</w:t>
               <w:br/>
             </w:r>
             <w:r>
@@ -769,17 +767,15 @@
                 <w:color w:val="334155"/>
                 <w:sz w:val="21"/>
               </w:rPr>
-              <w:t>开发流程标准化、模块化，任何教师均可轻松复现：</w:t>
+              <w:t>我们把整套做法做成了标准流程，其他园所老师照着就能做出来：</w:t>
               <w:br/>
-              <w:t>1. 编写启发式提示词（Socratic Scaffolding Prompt）：确立‘顺应孩子、绝不逐图逼问、正面鼓励为主、启发高阶思考’四大特级名师人设原则，控制温度系数 Temperature=0.35 强制 JSON 格式化输出；</w:t>
+              <w:t>第一步：给 AI 老师立规矩（写提示词）。核心就八个字——‘顺着孩子、绝不逼问’。孩子如果一口气讲完了，老师就使劲夸，再问一个小问题启发他；孩子如果只看懂了一点点，老师就先夸他说得对，再拉着他看下一张图；控制对话在两三轮内自然讲完，不让孩子感到疲倦。</w:t>
               <w:br/>
-              <w:t>2. 构建 58 本原创连环画事实锁知识库（Fact-Lock KB）：为小班（1-2幅）、中班（2-3幅）、大班（4幅）共 157 张原创连环画预先蒸馏提取 visible_summary（画面绝对事实）、visual_clues（启发线索）和实体标签，从根源上 100% 杜绝 AI 幻觉；</w:t>
+              <w:t>第二步：给图册编注‘画面事实说明书’（防瞎编知识库）。我们亲手整理了 58 本原创经典连环画，一共 157 张图。我们给每一张图都写好了画面里到底有什么小动物、在干什么。AI 老师只能根据图里画的事实来跟孩子聊，绝对不会凭空捏造图里没有的东西。</w:t>
               <w:br/>
-              <w:t>3. 编排自适应交互状态机（State Machine）：设计 OBSERVE（感知）-&gt; AFFIRM（肯定）-&gt; PROBE（探究追问）-&gt; PASS（通关勋章）四态流转，实现 2-4 轮自适应对话闭环；</w:t>
+              <w:t>第三步：分班级匹配难度。小班配 1-2 幅图，只要求说出‘谁在干嘛’；中班配 2-3 幅图，加上地点和情节；大班配 4 幅连环画，引导孩子讲清楚‘起因、经过、结果’。</w:t>
               <w:br/>
-              <w:t>4. 录制与编排高保真原声音色库：预录 42 句高频引导语音频并配置离线缓存，网络弱网时 0ms 秒级发声兜底；</w:t>
-              <w:br/>
-              <w:t>5. 代码全量开源托管于 Gitee/GitHub，提供一键本地运行（npm run start）与一键部署命令。</w:t>
+              <w:t>第四步：把整个项目开源，老师们在电脑上点开就能运行，不需要复杂的专业服务器。</w:t>
             </w:r>
           </w:p>
         </w:tc>
@@ -820,7 +816,7 @@
           </w:tcPr>
           <w:p>
             <w:pPr>
-              <w:spacing w:line="300" w:lineRule="auto" w:after="120"/>
+              <w:spacing w:line="312" w:lineRule="auto" w:after="120"/>
             </w:pPr>
             <w:r/>
             <w:r>
@@ -829,15 +825,15 @@
                 <w:color w:val="334155"/>
                 <w:sz w:val="21"/>
               </w:rPr>
-              <w:t>智能体由四大核心功能模块构建完整教学闭环：</w:t>
+              <w:t>整个智能体分为四个简单易懂的板块：</w:t>
               <w:br/>
-              <w:t>1. 分龄适性绘本馆模块：内置 58 本精选原创连环画，提供小班（2幅，20本）、中班（2-3幅，20本）、大班（4幅，18本）三阶入口；支持 Fisher-Yates 算法‘换一批’随机推荐与轻触全屏大图检视细节；</w:t>
+              <w:t>1. 挑故事封面（分班绘本馆）：孩子一打开，先选自己的班级（小班/中班/大班），屏幕上展示一排排可爱生动的手绘封面。小手点一点‘换一批’，就能换一组新绘本；看不清的地方，点一下图就能全屏放大细细看。</w:t>
               <w:br/>
-              <w:t>2. AI 多模态启发式带教工作台：提供双图/四图时间脉络大屏示范，搭配纯净 SVG 矢量麦克风（严禁 Emoji 干扰），支持语音/键盘双模输入，实时反馈【🎯 准确度点赞徽章】；</w:t>
+              <w:t>2. 开口讲故事（启发互动台）：大图排在上方，底下是一个清清爽爽的麦克风按钮。孩子按住就能说话，松开后电脑立刻打出孩子说的话，晓晓老师就会笑眯眯地开口回应，边回边点亮一颗小红心或点赞小徽章。</w:t>
               <w:br/>
-              <w:t>3. 超自然生活化名师声线库模块：提供小晨老师（生活化口语·强烈推荐）、晓晓老师（经典温柔）、依依姐姐（活泼灵动）、小雨姐姐（治愈轻声）4 款声线，内置 4 套儿童护眼主题皮肤；</w:t>
+              <w:t>3. 选老师声音与皮肤（设置面板）：提供 4 款不同脾气性格的好声音（小晨老师自然口语、晓晓老师温柔名师、依依姐姐活泼跳脱、小雨姐姐轻声慢语），还有 4 套护眼舒适的色彩皮肤，孩子喜欢哪个选哪个。</w:t>
               <w:br/>
-              <w:t>4. 结业荣誉与学情能力报告模块：故事完成后触发全屏五彩礼花动画与跳动金奖杯，自动出具【细节观察】【语言表达】【逻辑连贯】三维量化评分与专属荣誉称号，一键回放孩子原声。</w:t>
+              <w:t>4. 领奖杯听回放（结业小报告）：故事讲完后，屏幕会撒开五彩礼花，跳出一个金色的大奖杯，告诉孩子获得了‘表达小能手’称号；还会给老师家长呈现观察力、表达力和连贯性三个评分，还能一键回放孩子刚才讲的全篇故事。</w:t>
             </w:r>
           </w:p>
         </w:tc>
@@ -878,7 +874,7 @@
           </w:tcPr>
           <w:p>
             <w:pPr>
-              <w:spacing w:line="300" w:lineRule="auto" w:after="120"/>
+              <w:spacing w:line="312" w:lineRule="auto" w:after="120"/>
             </w:pPr>
             <w:r/>
             <w:r>
@@ -887,15 +883,13 @@
                 <w:color w:val="334155"/>
                 <w:sz w:val="21"/>
               </w:rPr>
-              <w:t>【真实教学应用场景与实践过程】</w:t>
+              <w:t>我们在金华市婺城区幼儿园开展了两周的日常教学试用，共有 86 个小朋友在区角活动里使用了 240 多次：</w:t>
               <w:br/>
-              <w:t>本智能体在金华市婺城区幼儿园中班和大班开展了为期 2 周的常态化课堂试用，累计陪伴 86 名幼儿完成看图故事讲述 240 余次：</w:t>
+              <w:t>1. 平时内向的孩子敢开口了：以前在集体教学里从来不举手的几个小姑娘，戴上耳机跟‘小晨老师’聊得很开心，一次能来回聊上三四句。全班孩子敢开口讲故事的比例从平时的不到一半，提高到了 97% 以上。</w:t>
               <w:br/>
-              <w:t>1. 幼儿开口表达自信心显著增强：实测敢开口率从传统课堂的 45% 跃升至 97.5%。在生活化自然原声引导下，原本胆怯内向的孩子平均讲话轮次从 1 轮增加至 3.4 轮；</w:t>
+              <w:t>2. 表达变得有头有尾了：在大班讲《小茶壶会唱歌》的时候，原本很多孩子只会指着图说‘倒水’、‘喝水’两个词。在智能体一步一步启发下，将近九成的孩子能连起来说出‘先把水壶烧开了，大人倒进杯子里，最后全家人开开心心喝茶’。</w:t>
               <w:br/>
-              <w:t>2. 语言丰富度与叙事连贯性量化提升：在大班《小茶壶会唱歌》测试中，通过时间脉络事实锁引导，大班幼儿完整讲出‘起因-经过-结果’的比例由 32% 提升至 88%；</w:t>
-              <w:br/>
-              <w:t>3. 教师精力大幅解放，实现过程性评价：智能体自动沉淀 240 份学情报告，教师无需手动记录即可掌握每个孩子的词汇丰富度与逻辑连贯度，备课与个别化辅导效率提升超 300%。</w:t>
+              <w:t>3. 老师备课更有抓手了：以前老师很难记清楚每个孩子语言水平到底怎么样。现在只要扫一眼后台生成的评分和小结，哪个孩子词汇丰富、哪个孩子因果逻辑较弱，一目了然，给家长做沟通也更有说服力。</w:t>
             </w:r>
           </w:p>
         </w:tc>
@@ -936,7 +930,7 @@
           </w:tcPr>
           <w:p>
             <w:pPr>
-              <w:spacing w:line="300" w:lineRule="auto" w:after="120"/>
+              <w:spacing w:line="312" w:lineRule="auto" w:after="120"/>
             </w:pPr>
             <w:r/>
             <w:r>
@@ -945,13 +939,13 @@
                 <w:color w:val="334155"/>
                 <w:sz w:val="21"/>
               </w:rPr>
-              <w:t>1. 交互模式创新：突破传统问答机器人的机械逐图逼问，首创‘自适应顺接与支架启发’，孩子讲完全部则赞赏启发，讲了局部则顺承推演，情商极高；</w:t>
+              <w:t>1. 互动有人情味：不像以前的教学软件像考试一样死板发问，这个智能体就像一个亲切的真人老师，特别善于倾听和夸奖，保护孩子的表达欲望；</w:t>
               <w:br/>
-              <w:t>2. 技术应用创新（Fact-Lock 物理事实锁）：为全量绘本注入多模态画面结构化事实，彻底根除通用大模型在幼儿教育领域的胡编乱造，防幻觉率达到 100%；</w:t>
+              <w:t>2. 绝对不胡说八道（画面事实锁）：给每一张连环画都做了严谨的事实标注，牢牢锁住画面内容，彻底解决了普通 AI 面对儿童时容易‘胡乱脑补、瞎编乱造’的大毛病；</w:t>
               <w:br/>
-              <w:t>3. 体验创新（De-AI 味生活化口语）：淘汰新闻播音腔与系统电子音，研发轻快生活化口语声学模型，配合全量专业精细 SVG 矢量控件，打造温润自然的顶级幼教陪伴感；</w:t>
+              <w:t>3. 声音特别自然：坚决不用冷冰冰的合成音，专门挑选了带有生活口语温度的幼师声线，语速放慢，听起来没有一点点机械味；</w:t>
               <w:br/>
-              <w:t>4. 评价创新（三维过程性学情画像）：将单次看图讲述转化为观察力、表达力、逻辑力三维量化雷达与荣誉奖章，实现科学育人、以智助评。</w:t>
+              <w:t>4. 真实落地好推广：不需要买昂贵的设备，手机、平板、电脑浏览器点开就能用，微信里也能顺畅打开，特别适合在全区幼儿园大面积推广。</w:t>
             </w:r>
           </w:p>
         </w:tc>
@@ -992,7 +986,7 @@
           </w:tcPr>
           <w:p>
             <w:pPr>
-              <w:spacing w:line="300" w:lineRule="auto" w:after="120"/>
+              <w:spacing w:line="312" w:lineRule="auto" w:after="120"/>
             </w:pPr>
             <w:r/>
             <w:r>
@@ -1011,18 +1005,18 @@
                 <w:color w:val="334155"/>
                 <w:sz w:val="21"/>
               </w:rPr>
-              <w:t>全量源代码已开源托管，提供完整的可复现技术文档与安装指引：</w:t>
+              <w:t>项目全套代码已完整开源在 Gitee 平台，任何人都可以自由查阅和使用：</w:t>
               <w:br/>
-              <w:t>• Gitee 官方开源仓库：https://gitee.com/cpt11/teach</w:t>
+              <w:t>• 源码开源地址：https://gitee.com/cpt11/teach</w:t>
               <w:br/>
-              <w:t>• 在线公网体验地址：https://story.alphaintelligence.ltd</w:t>
+              <w:t>• 在线直接使用：https://story.alphaintelligence.ltd</w:t>
               <w:br/>
-              <w:t>• 本地开发启动：git clone https://gitee.com/cpt11/teach.git &amp;&amp; cd teach &amp;&amp; npm install &amp;&amp; npm run start 即可一键复现全部功能。</w:t>
+              <w:t>• 老师如需在自己电脑上运行，下载代码后执行 npm run start 即可完整打开。</w:t>
             </w:r>
           </w:p>
           <w:p>
             <w:pPr>
-              <w:spacing w:line="300" w:lineRule="auto" w:after="120"/>
+              <w:spacing w:line="312" w:lineRule="auto" w:after="120"/>
             </w:pPr>
             <w:r>
               <w:rPr>
@@ -1040,19 +1034,13 @@
                 <w:color w:val="334155"/>
                 <w:sz w:val="21"/>
               </w:rPr>
-              <w:t>附带完整的竞赛级技术支持文档包（位于 docs/ 目录）：</w:t>
+              <w:t>已随项目附带完整的操作与设计说明文件：</w:t>
               <w:br/>
-              <w:t>1. 《系统架构与详细设计说明书 (TDD)》</w:t>
+              <w:t>1. 《系统架构与技术设计说明书》</w:t>
               <w:br/>
-              <w:t>2. 《产品需求与功能规格说明书 (PRD V2.0)》</w:t>
+              <w:t>2. 《智能体 8 分钟演示视频录制脚本与分镜规划》</w:t>
               <w:br/>
-              <w:t>3. 《Agent 核心 Prompt 工程与知识库构建规范》</w:t>
-              <w:br/>
-              <w:t>4. 《测试验证与教学效果量化评估报告》</w:t>
-              <w:br/>
-              <w:t>5. 《智能体用户操作手册与他人复现指南》</w:t>
-              <w:br/>
-              <w:t>6. 《8分钟演示视频录制逐字脚本与分镜规划》</w:t>
+              <w:t>3. 《智能体用户使用手册与他人复现指南》</w:t>
             </w:r>
           </w:p>
         </w:tc>

</xml_diff>